<commit_message>
added interpretation of results in notes section.-Luca
</commit_message>
<xml_diff>
--- a/results/experiment_1_to_30_agents/notes on experiment.docx
+++ b/results/experiment_1_to_30_agents/notes on experiment.docx
@@ -108,6 +108,165 @@
           <w:szCs w:val="24"/>
         </w:rPr>
         <w:t>The key output of interest is the relationship between the best-performing ε and the number of agents n. A flat relationship would suggest stable scaling behaviour, whereas a trend or regime change would imply that coordination demands evolve as decentralized systems grow larger. This experiment therefore serves as a more rigorous test of whether the earlier findings represent a general property or only a small-scale effect.</w:t>
+      </w:r>
+    </w:p>
+    <w:p>
+      <w:pPr>
+        <w:jc w:val="both"/>
+        <w:rPr>
+          <w:rFonts w:ascii="Times New Roman" w:hAnsi="Times New Roman" w:cs="Times New Roman"/>
+          <w:sz w:val="24"/>
+          <w:szCs w:val="24"/>
+        </w:rPr>
+      </w:pPr>
+    </w:p>
+    <w:p>
+      <w:pPr>
+        <w:jc w:val="both"/>
+        <w:rPr>
+          <w:rFonts w:ascii="Times New Roman" w:hAnsi="Times New Roman" w:cs="Times New Roman"/>
+          <w:b/>
+          <w:bCs/>
+          <w:sz w:val="28"/>
+          <w:szCs w:val="28"/>
+        </w:rPr>
+      </w:pPr>
+      <w:r>
+        <w:rPr>
+          <w:rFonts w:ascii="Times New Roman" w:hAnsi="Times New Roman" w:cs="Times New Roman"/>
+          <w:b/>
+          <w:bCs/>
+          <w:sz w:val="28"/>
+          <w:szCs w:val="28"/>
+        </w:rPr>
+        <w:t>Results:</w:t>
+      </w:r>
+    </w:p>
+    <w:p>
+      <w:pPr>
+        <w:jc w:val="both"/>
+        <w:rPr>
+          <w:rFonts w:ascii="Times New Roman" w:hAnsi="Times New Roman" w:cs="Times New Roman"/>
+          <w:sz w:val="24"/>
+          <w:szCs w:val="24"/>
+        </w:rPr>
+      </w:pPr>
+      <w:r>
+        <w:rPr>
+          <w:rFonts w:ascii="Times New Roman" w:hAnsi="Times New Roman" w:cs="Times New Roman"/>
+          <w:sz w:val="24"/>
+          <w:szCs w:val="24"/>
+        </w:rPr>
+        <w:t>The extended scaling experiment (from 1 agent:3 arms up to 30 agents:90 arms under linear collision sharing) provides much clearer evidence than the earlier small-scale tests. Across all configurations, system performance follows the same qualitative shape: very low reward at ε = 0, a rapid improvement once a small amount of exploration is introduced, a broad maximum at moderate ε values, and a gradual decline when ε becomes too large. This confirms that the exploration–coordination trade-off is robust and persists as the system grows.</w:t>
+      </w:r>
+    </w:p>
+    <w:p>
+      <w:pPr>
+        <w:jc w:val="both"/>
+        <w:rPr>
+          <w:rFonts w:ascii="Times New Roman" w:hAnsi="Times New Roman" w:cs="Times New Roman"/>
+          <w:sz w:val="24"/>
+          <w:szCs w:val="24"/>
+        </w:rPr>
+      </w:pPr>
+      <w:r>
+        <w:rPr>
+          <w:rFonts w:ascii="Times New Roman" w:hAnsi="Times New Roman" w:cs="Times New Roman"/>
+          <w:sz w:val="24"/>
+          <w:szCs w:val="24"/>
+        </w:rPr>
+        <w:lastRenderedPageBreak/>
+        <w:t>The most important result is that the optimal ε remains highly stable across scale. The best-performing values lie in a narrow interval between approximately 0.06 and 0.10 for all configurations, with most larger systems clustering around 0.06–0.08. This strongly supports the scaling hypothesis that, when the agent-to-arm ratio is fixed at 1:3, the exploration level required for good collective performance does not increase with system size. In practical terms, larger decentralized systems do not need proportionally more exploration than smaller ones.</w:t>
+      </w:r>
+    </w:p>
+    <w:p>
+      <w:pPr>
+        <w:jc w:val="both"/>
+        <w:rPr>
+          <w:rFonts w:ascii="Times New Roman" w:hAnsi="Times New Roman" w:cs="Times New Roman"/>
+          <w:sz w:val="24"/>
+          <w:szCs w:val="24"/>
+        </w:rPr>
+      </w:pPr>
+      <w:r>
+        <w:rPr>
+          <w:rFonts w:ascii="Times New Roman" w:hAnsi="Times New Roman" w:cs="Times New Roman"/>
+          <w:sz w:val="24"/>
+          <w:szCs w:val="24"/>
+        </w:rPr>
+        <w:t>The normalized reward curves almost overlap near their peaks, showing that systems of very different sizes achieve nearly the same fraction of their own maximum reward at similar ε values. This suggests that the balance between learning new arms and avoiding unnecessary collisions scales consistently. The slight downward drift in best ε for larger n may indicate that as the number of available arms increases, agents can rely slightly more on exploitation once initial learning has occurred, but the effect is small.</w:t>
+      </w:r>
+    </w:p>
+    <w:p>
+      <w:pPr>
+        <w:jc w:val="both"/>
+        <w:rPr>
+          <w:rFonts w:ascii="Times New Roman" w:hAnsi="Times New Roman" w:cs="Times New Roman"/>
+          <w:sz w:val="24"/>
+          <w:szCs w:val="24"/>
+        </w:rPr>
+      </w:pPr>
+      <w:r>
+        <w:rPr>
+          <w:rFonts w:ascii="Times New Roman" w:hAnsi="Times New Roman" w:cs="Times New Roman"/>
+          <w:sz w:val="24"/>
+          <w:szCs w:val="24"/>
+        </w:rPr>
+        <w:t>Collision-rate results also show a common pattern across all system sizes. Collisions are maximal at ε = 0 because agents become trapped on the same high-value arms, then fall sharply when exploration is introduced, and rise again when ε becomes too large because random choices create unnecessary overlap. The reward-maximizing ε occurs in the region where collisions are reduced substantially but exploration is not yet excessive.</w:t>
+      </w:r>
+    </w:p>
+    <w:p>
+      <w:pPr>
+        <w:jc w:val="both"/>
+        <w:rPr>
+          <w:rFonts w:ascii="Times New Roman" w:hAnsi="Times New Roman" w:cs="Times New Roman"/>
+          <w:sz w:val="24"/>
+          <w:szCs w:val="24"/>
+        </w:rPr>
+      </w:pPr>
+      <w:r>
+        <w:rPr>
+          <w:rFonts w:ascii="Times New Roman" w:hAnsi="Times New Roman" w:cs="Times New Roman"/>
+          <w:sz w:val="24"/>
+          <w:szCs w:val="24"/>
+        </w:rPr>
+        <w:t>Average reward per agent increases with larger configurations because the reward landscape expands with n in the current arm-generation design. However, after normalization, the same underlying behavioural pattern remains visible. This means the absolute rewards differ by construction, but the strategic effect of ε is comparable across scales.</w:t>
+      </w:r>
+    </w:p>
+    <w:p>
+      <w:pPr>
+        <w:jc w:val="both"/>
+        <w:rPr>
+          <w:rFonts w:ascii="Times New Roman" w:hAnsi="Times New Roman" w:cs="Times New Roman"/>
+          <w:sz w:val="24"/>
+          <w:szCs w:val="24"/>
+        </w:rPr>
+      </w:pPr>
+      <w:r>
+        <w:rPr>
+          <w:rFonts w:ascii="Times New Roman" w:hAnsi="Times New Roman" w:cs="Times New Roman"/>
+          <w:sz w:val="24"/>
+          <w:szCs w:val="24"/>
+        </w:rPr>
+        <w:t>Reward inequality is highest at very low ε and declines steadily as ε increases. This indicates that limited exploration allows some agents to monopolize strong arms, whereas moderate exploration distributes access more evenly across the population. Therefore, the same ε region that maximizes efficiency also improves fairness relative to purely greedy behaviour.</w:t>
+      </w:r>
+    </w:p>
+    <w:p>
+      <w:pPr>
+        <w:jc w:val="both"/>
+        <w:rPr>
+          <w:rFonts w:ascii="Times New Roman" w:hAnsi="Times New Roman" w:cs="Times New Roman"/>
+          <w:sz w:val="24"/>
+          <w:szCs w:val="24"/>
+        </w:rPr>
+      </w:pPr>
+      <w:r>
+        <w:rPr>
+          <w:rFonts w:ascii="Times New Roman" w:hAnsi="Times New Roman" w:cs="Times New Roman"/>
+          <w:sz w:val="24"/>
+          <w:szCs w:val="24"/>
+        </w:rPr>
+        <w:t>Overall, this experiment provides strong evidence that under linear collision sharing and a fixed 1:3 crowding ratio, the optimal exploration rate is approximately scale-invariant. A moderate ε around 0.07–0.08 appears to be a robust operating point from very small to substantially larger systems. This is an important result because it suggests that tuning ε on small systems may generalize well to much larger decentralized environments.</w:t>
       </w:r>
     </w:p>
     <w:sectPr>

</xml_diff>